<commit_message>
FIX: #993, #1023 y #1041
</commit_message>
<xml_diff>
--- a/202605_SISTRA2-VERSIONES_es.docx
+++ b/202605_SISTRA2-VERSIONES_es.docx
@@ -12815,17 +12815,24 @@
           <w:ilvl w:val="1"/>
           <w:numId w:val="4"/>
         </w:numPr>
+        <w:rPr>
+          <w:lang w:val="pt-PT"/>
+        </w:rPr>
       </w:pPr>
       <w:hyperlink r:id="rId13">
         <w:r>
           <w:rPr>
             <w:color w:val="0000FF"/>
             <w:u w:val="single"/>
+            <w:lang w:val="pt-PT"/>
           </w:rPr>
           <w:t>https://dev.caib.es/seucaib</w:t>
         </w:r>
       </w:hyperlink>
       <w:r>
+        <w:rPr>
+          <w:lang w:val="pt-PT"/>
+        </w:rPr>
         <w:t xml:space="preserve"> para DEV.</w:t>
       </w:r>
     </w:p>
@@ -13404,14 +13411,16 @@
           <w:color w:val="000000"/>
           <w:sz w:val="22"/>
           <w:szCs w:val="22"/>
-        </w:rPr>
-      </w:pPr>
-      <w:r>
-        <w:rPr>
-          <w:rFonts w:ascii="Calibri" w:eastAsia="Calibri" w:hAnsi="Calibri" w:cs="Calibri"/>
-          <w:color w:val="000000"/>
-          <w:sz w:val="22"/>
-          <w:szCs w:val="22"/>
+          <w:lang w:val="pt-PT"/>
+        </w:rPr>
+      </w:pPr>
+      <w:r>
+        <w:rPr>
+          <w:rFonts w:ascii="Calibri" w:eastAsia="Calibri" w:hAnsi="Calibri" w:cs="Calibri"/>
+          <w:color w:val="000000"/>
+          <w:sz w:val="22"/>
+          <w:szCs w:val="22"/>
+          <w:lang w:val="pt-PT"/>
         </w:rPr>
         <w:t>#211 Multipàgina - STG - Desenvolupament: Revisió funcionament multipàgina</w:t>
       </w:r>
@@ -13779,14 +13788,16 @@
           <w:color w:val="000000"/>
           <w:sz w:val="22"/>
           <w:szCs w:val="22"/>
-        </w:rPr>
-      </w:pPr>
-      <w:r>
-        <w:rPr>
-          <w:rFonts w:ascii="Calibri" w:eastAsia="Calibri" w:hAnsi="Calibri" w:cs="Calibri"/>
-          <w:color w:val="000000"/>
-          <w:sz w:val="22"/>
-          <w:szCs w:val="22"/>
+          <w:lang w:val="pt-PT"/>
+        </w:rPr>
+      </w:pPr>
+      <w:r>
+        <w:rPr>
+          <w:rFonts w:ascii="Calibri" w:eastAsia="Calibri" w:hAnsi="Calibri" w:cs="Calibri"/>
+          <w:color w:val="000000"/>
+          <w:sz w:val="22"/>
+          <w:szCs w:val="22"/>
+          <w:lang w:val="pt-PT"/>
         </w:rPr>
         <w:t>#216 Multipàgina - STT - Desenvolupament: Adaptar consum REST</w:t>
       </w:r>
@@ -13857,14 +13868,16 @@
           <w:color w:val="000000"/>
           <w:sz w:val="22"/>
           <w:szCs w:val="22"/>
-        </w:rPr>
-      </w:pPr>
-      <w:r>
-        <w:rPr>
-          <w:rFonts w:ascii="Calibri" w:eastAsia="Calibri" w:hAnsi="Calibri" w:cs="Calibri"/>
-          <w:color w:val="000000"/>
-          <w:sz w:val="22"/>
-          <w:szCs w:val="22"/>
+          <w:lang w:val="pt-PT"/>
+        </w:rPr>
+      </w:pPr>
+      <w:r>
+        <w:rPr>
+          <w:rFonts w:ascii="Calibri" w:eastAsia="Calibri" w:hAnsi="Calibri" w:cs="Calibri"/>
+          <w:color w:val="000000"/>
+          <w:sz w:val="22"/>
+          <w:szCs w:val="22"/>
+          <w:lang w:val="pt-PT"/>
         </w:rPr>
         <w:t>#217 Multipàgina - STT - Desenvolupament: Adaptar core api</w:t>
       </w:r>
@@ -13935,14 +13948,16 @@
           <w:color w:val="000000"/>
           <w:sz w:val="22"/>
           <w:szCs w:val="22"/>
-        </w:rPr>
-      </w:pPr>
-      <w:r>
-        <w:rPr>
-          <w:rFonts w:ascii="Calibri" w:eastAsia="Calibri" w:hAnsi="Calibri" w:cs="Calibri"/>
-          <w:color w:val="000000"/>
-          <w:sz w:val="22"/>
-          <w:szCs w:val="22"/>
+          <w:lang w:val="pt-PT"/>
+        </w:rPr>
+      </w:pPr>
+      <w:r>
+        <w:rPr>
+          <w:rFonts w:ascii="Calibri" w:eastAsia="Calibri" w:hAnsi="Calibri" w:cs="Calibri"/>
+          <w:color w:val="000000"/>
+          <w:sz w:val="22"/>
+          <w:szCs w:val="22"/>
+          <w:lang w:val="pt-PT"/>
         </w:rPr>
         <w:t>#218 Multipàgina - STT - Desenvolupament: Adaptació lògica passa emplenar formulari</w:t>
       </w:r>
@@ -14461,14 +14476,16 @@
           <w:color w:val="000000"/>
           <w:sz w:val="22"/>
           <w:szCs w:val="22"/>
-        </w:rPr>
-      </w:pPr>
-      <w:r>
-        <w:rPr>
-          <w:rFonts w:ascii="Calibri" w:eastAsia="Calibri" w:hAnsi="Calibri" w:cs="Calibri"/>
-          <w:color w:val="000000"/>
-          <w:sz w:val="22"/>
-          <w:szCs w:val="22"/>
+          <w:lang w:val="pt-PT"/>
+        </w:rPr>
+      </w:pPr>
+      <w:r>
+        <w:rPr>
+          <w:rFonts w:ascii="Calibri" w:eastAsia="Calibri" w:hAnsi="Calibri" w:cs="Calibri"/>
+          <w:color w:val="000000"/>
+          <w:sz w:val="22"/>
+          <w:szCs w:val="22"/>
+          <w:lang w:val="pt-PT"/>
         </w:rPr>
         <w:t>#225 Multipàgina - STT - Desenvolupament: Proves unitàries Junit</w:t>
       </w:r>
@@ -17358,14 +17375,16 @@
           <w:color w:val="000000"/>
           <w:sz w:val="22"/>
           <w:szCs w:val="22"/>
-        </w:rPr>
-      </w:pPr>
-      <w:r>
-        <w:rPr>
-          <w:rFonts w:ascii="Calibri" w:eastAsia="Calibri" w:hAnsi="Calibri" w:cs="Calibri"/>
-          <w:color w:val="000000"/>
-          <w:sz w:val="22"/>
-          <w:szCs w:val="22"/>
+          <w:lang w:val="pt-PT"/>
+        </w:rPr>
+      </w:pPr>
+      <w:r>
+        <w:rPr>
+          <w:rFonts w:ascii="Calibri" w:eastAsia="Calibri" w:hAnsi="Calibri" w:cs="Calibri"/>
+          <w:color w:val="000000"/>
+          <w:sz w:val="22"/>
+          <w:szCs w:val="22"/>
+          <w:lang w:val="pt-PT"/>
         </w:rPr>
         <w:t>#301 STT: Visualitzar l'import calculat d'una taxa simulada</w:t>
       </w:r>
@@ -18313,14 +18332,16 @@
           <w:color w:val="000000"/>
           <w:sz w:val="22"/>
           <w:szCs w:val="22"/>
-        </w:rPr>
-      </w:pPr>
-      <w:r>
-        <w:rPr>
-          <w:rFonts w:ascii="Calibri" w:eastAsia="Calibri" w:hAnsi="Calibri" w:cs="Calibri"/>
-          <w:color w:val="000000"/>
-          <w:sz w:val="22"/>
-          <w:szCs w:val="22"/>
+          <w:lang w:val="pt-PT"/>
+        </w:rPr>
+      </w:pPr>
+      <w:r>
+        <w:rPr>
+          <w:rFonts w:ascii="Calibri" w:eastAsia="Calibri" w:hAnsi="Calibri" w:cs="Calibri"/>
+          <w:color w:val="000000"/>
+          <w:sz w:val="22"/>
+          <w:szCs w:val="22"/>
+          <w:lang w:val="pt-PT"/>
         </w:rPr>
         <w:t>#334 STG: Actualitzar dominis emprats per tràmit</w:t>
       </w:r>
@@ -18610,14 +18631,16 @@
           <w:color w:val="000000"/>
           <w:sz w:val="22"/>
           <w:szCs w:val="22"/>
-        </w:rPr>
-      </w:pPr>
-      <w:r>
-        <w:rPr>
-          <w:rFonts w:ascii="Calibri" w:eastAsia="Calibri" w:hAnsi="Calibri" w:cs="Calibri"/>
-          <w:color w:val="000000"/>
-          <w:sz w:val="22"/>
-          <w:szCs w:val="22"/>
+          <w:lang w:val="pt-PT"/>
+        </w:rPr>
+      </w:pPr>
+      <w:r>
+        <w:rPr>
+          <w:rFonts w:ascii="Calibri" w:eastAsia="Calibri" w:hAnsi="Calibri" w:cs="Calibri"/>
+          <w:color w:val="000000"/>
+          <w:sz w:val="22"/>
+          <w:szCs w:val="22"/>
+          <w:lang w:val="pt-PT"/>
         </w:rPr>
         <w:t>#339 STG: Afegir fitxers d'ajuda als annexes com administrador d'àrea</w:t>
       </w:r>
@@ -18638,14 +18661,16 @@
           <w:color w:val="000000"/>
           <w:sz w:val="22"/>
           <w:szCs w:val="22"/>
-        </w:rPr>
-      </w:pPr>
-      <w:r>
-        <w:rPr>
-          <w:rFonts w:ascii="Calibri" w:eastAsia="Calibri" w:hAnsi="Calibri" w:cs="Calibri"/>
-          <w:color w:val="000000"/>
-          <w:sz w:val="22"/>
-          <w:szCs w:val="22"/>
+          <w:lang w:val="pt-PT"/>
+        </w:rPr>
+      </w:pPr>
+      <w:r>
+        <w:rPr>
+          <w:rFonts w:ascii="Calibri" w:eastAsia="Calibri" w:hAnsi="Calibri" w:cs="Calibri"/>
+          <w:color w:val="000000"/>
+          <w:sz w:val="22"/>
+          <w:szCs w:val="22"/>
+          <w:lang w:val="pt-PT"/>
         </w:rPr>
         <w:t>Esta issue permite a un administrador de área, utilizar el icono para anexar ficheros de ayuda a los ficheros anexos.</w:t>
       </w:r>
@@ -18666,6 +18691,7 @@
           <w:color w:val="000000"/>
           <w:sz w:val="22"/>
           <w:szCs w:val="22"/>
+          <w:lang w:val="pt-PT"/>
         </w:rPr>
       </w:pPr>
     </w:p>
@@ -24550,14 +24576,16 @@
           <w:color w:val="000000"/>
           <w:sz w:val="22"/>
           <w:szCs w:val="22"/>
-        </w:rPr>
-      </w:pPr>
-      <w:r>
-        <w:rPr>
-          <w:rFonts w:ascii="Calibri" w:eastAsia="Calibri" w:hAnsi="Calibri" w:cs="Calibri"/>
-          <w:color w:val="000000"/>
-          <w:sz w:val="22"/>
-          <w:szCs w:val="22"/>
+          <w:lang w:val="pt-PT"/>
+        </w:rPr>
+      </w:pPr>
+      <w:r>
+        <w:rPr>
+          <w:rFonts w:ascii="Calibri" w:eastAsia="Calibri" w:hAnsi="Calibri" w:cs="Calibri"/>
+          <w:color w:val="000000"/>
+          <w:sz w:val="22"/>
+          <w:szCs w:val="22"/>
+          <w:lang w:val="pt-PT"/>
         </w:rPr>
         <w:t>#431 Bug a STT amb llista dinàmica d'annexos</w:t>
       </w:r>
@@ -24894,14 +24922,16 @@
           <w:color w:val="000000"/>
           <w:sz w:val="22"/>
           <w:szCs w:val="22"/>
-        </w:rPr>
-      </w:pPr>
-      <w:r>
-        <w:rPr>
-          <w:rFonts w:ascii="Calibri" w:eastAsia="Calibri" w:hAnsi="Calibri" w:cs="Calibri"/>
-          <w:color w:val="000000"/>
-          <w:sz w:val="22"/>
-          <w:szCs w:val="22"/>
+          <w:lang w:val="pt-PT"/>
+        </w:rPr>
+      </w:pPr>
+      <w:r>
+        <w:rPr>
+          <w:rFonts w:ascii="Calibri" w:eastAsia="Calibri" w:hAnsi="Calibri" w:cs="Calibri"/>
+          <w:color w:val="000000"/>
+          <w:sz w:val="22"/>
+          <w:szCs w:val="22"/>
+          <w:lang w:val="pt-PT"/>
         </w:rPr>
         <w:t>#452 Dinamitzar logo per UA a Formatador Genèric</w:t>
       </w:r>
@@ -26332,14 +26362,16 @@
           <w:color w:val="000000"/>
           <w:sz w:val="22"/>
           <w:szCs w:val="22"/>
-        </w:rPr>
-      </w:pPr>
-      <w:r>
-        <w:rPr>
-          <w:rFonts w:ascii="Calibri" w:eastAsia="Calibri" w:hAnsi="Calibri" w:cs="Calibri"/>
-          <w:color w:val="000000"/>
-          <w:sz w:val="22"/>
-          <w:szCs w:val="22"/>
+          <w:lang w:val="pt-PT"/>
+        </w:rPr>
+      </w:pPr>
+      <w:r>
+        <w:rPr>
+          <w:rFonts w:ascii="Calibri" w:eastAsia="Calibri" w:hAnsi="Calibri" w:cs="Calibri"/>
+          <w:color w:val="000000"/>
+          <w:sz w:val="22"/>
+          <w:szCs w:val="22"/>
+          <w:lang w:val="pt-PT"/>
         </w:rPr>
         <w:t>#381 Independitzar cada entitat i els seus tràmits</w:t>
       </w:r>
@@ -27891,14 +27923,16 @@
           <w:color w:val="000000"/>
           <w:sz w:val="22"/>
           <w:szCs w:val="22"/>
-        </w:rPr>
-      </w:pPr>
-      <w:r>
-        <w:rPr>
-          <w:rFonts w:ascii="Calibri" w:eastAsia="Calibri" w:hAnsi="Calibri" w:cs="Calibri"/>
-          <w:color w:val="000000"/>
-          <w:sz w:val="22"/>
-          <w:szCs w:val="22"/>
+          <w:lang w:val="pt-PT"/>
+        </w:rPr>
+      </w:pPr>
+      <w:r>
+        <w:rPr>
+          <w:rFonts w:ascii="Calibri" w:eastAsia="Calibri" w:hAnsi="Calibri" w:cs="Calibri"/>
+          <w:color w:val="000000"/>
+          <w:sz w:val="22"/>
+          <w:szCs w:val="22"/>
+          <w:lang w:val="pt-PT"/>
         </w:rPr>
         <w:t>#482 Modificar textos STT segons recomanacions OAE</w:t>
       </w:r>
@@ -28627,14 +28661,16 @@
           <w:color w:val="000000"/>
           <w:sz w:val="22"/>
           <w:szCs w:val="22"/>
-        </w:rPr>
-      </w:pPr>
-      <w:r>
-        <w:rPr>
-          <w:rFonts w:ascii="Calibri" w:eastAsia="Calibri" w:hAnsi="Calibri" w:cs="Calibri"/>
-          <w:color w:val="000000"/>
-          <w:sz w:val="22"/>
-          <w:szCs w:val="22"/>
+          <w:lang w:val="pt-PT"/>
+        </w:rPr>
+      </w:pPr>
+      <w:r>
+        <w:rPr>
+          <w:rFonts w:ascii="Calibri" w:eastAsia="Calibri" w:hAnsi="Calibri" w:cs="Calibri"/>
+          <w:color w:val="000000"/>
+          <w:sz w:val="22"/>
+          <w:szCs w:val="22"/>
+          <w:lang w:val="pt-PT"/>
         </w:rPr>
         <w:t>#506 Evitar l'enviament de \n \t a RW3</w:t>
       </w:r>
@@ -29289,14 +29325,16 @@
           <w:color w:val="000000"/>
           <w:sz w:val="22"/>
           <w:szCs w:val="22"/>
-        </w:rPr>
-      </w:pPr>
-      <w:r>
-        <w:rPr>
-          <w:rFonts w:ascii="Calibri" w:eastAsia="Calibri" w:hAnsi="Calibri" w:cs="Calibri"/>
-          <w:color w:val="000000"/>
-          <w:sz w:val="22"/>
-          <w:szCs w:val="22"/>
+          <w:lang w:val="pt-PT"/>
+        </w:rPr>
+      </w:pPr>
+      <w:r>
+        <w:rPr>
+          <w:rFonts w:ascii="Calibri" w:eastAsia="Calibri" w:hAnsi="Calibri" w:cs="Calibri"/>
+          <w:color w:val="000000"/>
+          <w:sz w:val="22"/>
+          <w:szCs w:val="22"/>
+          <w:lang w:val="pt-PT"/>
         </w:rPr>
         <w:t>#538 Actualitzar ajudes de DR (contractes SOAP)</w:t>
       </w:r>
@@ -30322,14 +30360,16 @@
           <w:color w:val="000000"/>
           <w:sz w:val="22"/>
           <w:szCs w:val="22"/>
-        </w:rPr>
-      </w:pPr>
-      <w:r>
-        <w:rPr>
-          <w:rFonts w:ascii="Calibri" w:eastAsia="Calibri" w:hAnsi="Calibri" w:cs="Calibri"/>
-          <w:color w:val="000000"/>
-          <w:sz w:val="22"/>
-          <w:szCs w:val="22"/>
+          <w:lang w:val="pt-PT"/>
+        </w:rPr>
+      </w:pPr>
+      <w:r>
+        <w:rPr>
+          <w:rFonts w:ascii="Calibri" w:eastAsia="Calibri" w:hAnsi="Calibri" w:cs="Calibri"/>
+          <w:color w:val="000000"/>
+          <w:sz w:val="22"/>
+          <w:szCs w:val="22"/>
+          <w:lang w:val="pt-PT"/>
         </w:rPr>
         <w:t>#561 Els Adm d'àrea no poden veure res a STH i els Adm d'Entitat no podem filtrar per tràmit</w:t>
       </w:r>
@@ -30741,14 +30781,16 @@
           <w:color w:val="000000"/>
           <w:sz w:val="22"/>
           <w:szCs w:val="22"/>
-        </w:rPr>
-      </w:pPr>
-      <w:r>
-        <w:rPr>
-          <w:rFonts w:ascii="Calibri" w:eastAsia="Calibri" w:hAnsi="Calibri" w:cs="Calibri"/>
-          <w:color w:val="000000"/>
-          <w:sz w:val="22"/>
-          <w:szCs w:val="22"/>
+          <w:lang w:val="pt-PT"/>
+        </w:rPr>
+      </w:pPr>
+      <w:r>
+        <w:rPr>
+          <w:rFonts w:ascii="Calibri" w:eastAsia="Calibri" w:hAnsi="Calibri" w:cs="Calibri"/>
+          <w:color w:val="000000"/>
+          <w:sz w:val="22"/>
+          <w:szCs w:val="22"/>
+          <w:lang w:val="pt-PT"/>
         </w:rPr>
         <w:t>#529 Refrescar automàticament Memòria Cau als avisos i als properties de Formatadors de Formularis</w:t>
       </w:r>
@@ -30819,14 +30861,16 @@
           <w:color w:val="000000"/>
           <w:sz w:val="22"/>
           <w:szCs w:val="22"/>
-        </w:rPr>
-      </w:pPr>
-      <w:r>
-        <w:rPr>
-          <w:rFonts w:ascii="Calibri" w:eastAsia="Calibri" w:hAnsi="Calibri" w:cs="Calibri"/>
-          <w:color w:val="000000"/>
-          <w:sz w:val="22"/>
-          <w:szCs w:val="22"/>
+          <w:lang w:val="pt-PT"/>
+        </w:rPr>
+      </w:pPr>
+      <w:r>
+        <w:rPr>
+          <w:rFonts w:ascii="Calibri" w:eastAsia="Calibri" w:hAnsi="Calibri" w:cs="Calibri"/>
+          <w:color w:val="000000"/>
+          <w:sz w:val="22"/>
+          <w:szCs w:val="22"/>
+          <w:lang w:val="pt-PT"/>
         </w:rPr>
         <w:t>#542 Memòria cau API per a DR</w:t>
       </w:r>
@@ -31497,14 +31541,16 @@
           <w:color w:val="000000"/>
           <w:sz w:val="22"/>
           <w:szCs w:val="22"/>
-        </w:rPr>
-      </w:pPr>
-      <w:r>
-        <w:rPr>
-          <w:rFonts w:ascii="Calibri" w:eastAsia="Calibri" w:hAnsi="Calibri" w:cs="Calibri"/>
-          <w:color w:val="000000"/>
-          <w:sz w:val="22"/>
-          <w:szCs w:val="22"/>
+          <w:lang w:val="pt-PT"/>
+        </w:rPr>
+      </w:pPr>
+      <w:r>
+        <w:rPr>
+          <w:rFonts w:ascii="Calibri" w:eastAsia="Calibri" w:hAnsi="Calibri" w:cs="Calibri"/>
+          <w:color w:val="000000"/>
+          <w:sz w:val="22"/>
+          <w:szCs w:val="22"/>
+          <w:lang w:val="pt-PT"/>
         </w:rPr>
         <w:t>#528 SIA com a filtre de cerca de tràmits a STH</w:t>
       </w:r>
@@ -31794,14 +31840,16 @@
           <w:color w:val="000000"/>
           <w:sz w:val="22"/>
           <w:szCs w:val="22"/>
-        </w:rPr>
-      </w:pPr>
-      <w:r>
-        <w:rPr>
-          <w:rFonts w:ascii="Calibri" w:eastAsia="Calibri" w:hAnsi="Calibri" w:cs="Calibri"/>
-          <w:color w:val="000000"/>
-          <w:sz w:val="22"/>
-          <w:szCs w:val="22"/>
+          <w:lang w:val="pt-PT"/>
+        </w:rPr>
+      </w:pPr>
+      <w:r>
+        <w:rPr>
+          <w:rFonts w:ascii="Calibri" w:eastAsia="Calibri" w:hAnsi="Calibri" w:cs="Calibri"/>
+          <w:color w:val="000000"/>
+          <w:sz w:val="22"/>
+          <w:szCs w:val="22"/>
+          <w:lang w:val="pt-PT"/>
         </w:rPr>
         <w:t>#584 Tractament dels camps multilínia amb retorns de carro</w:t>
       </w:r>
@@ -31872,14 +31920,16 @@
           <w:color w:val="000000"/>
           <w:sz w:val="22"/>
           <w:szCs w:val="22"/>
-        </w:rPr>
-      </w:pPr>
-      <w:r>
-        <w:rPr>
-          <w:rFonts w:ascii="Calibri" w:eastAsia="Calibri" w:hAnsi="Calibri" w:cs="Calibri"/>
-          <w:color w:val="000000"/>
-          <w:sz w:val="22"/>
-          <w:szCs w:val="22"/>
+          <w:lang w:val="pt-PT"/>
+        </w:rPr>
+      </w:pPr>
+      <w:r>
+        <w:rPr>
+          <w:rFonts w:ascii="Calibri" w:eastAsia="Calibri" w:hAnsi="Calibri" w:cs="Calibri"/>
+          <w:color w:val="000000"/>
+          <w:sz w:val="22"/>
+          <w:szCs w:val="22"/>
+          <w:lang w:val="pt-PT"/>
         </w:rPr>
         <w:t>#601 No permetre exportar o generar quaderns de càrrega sent desenvolupador</w:t>
       </w:r>
@@ -32024,14 +32074,16 @@
           <w:color w:val="000000"/>
           <w:sz w:val="22"/>
           <w:szCs w:val="22"/>
-        </w:rPr>
-      </w:pPr>
-      <w:r>
-        <w:rPr>
-          <w:rFonts w:ascii="Calibri" w:eastAsia="Calibri" w:hAnsi="Calibri" w:cs="Calibri"/>
-          <w:color w:val="000000"/>
-          <w:sz w:val="22"/>
-          <w:szCs w:val="22"/>
+          <w:lang w:val="pt-PT"/>
+        </w:rPr>
+      </w:pPr>
+      <w:r>
+        <w:rPr>
+          <w:rFonts w:ascii="Calibri" w:eastAsia="Calibri" w:hAnsi="Calibri" w:cs="Calibri"/>
+          <w:color w:val="000000"/>
+          <w:sz w:val="22"/>
+          <w:szCs w:val="22"/>
+          <w:lang w:val="pt-PT"/>
         </w:rPr>
         <w:t>#507 Amb Chrome no funciona check "Visualitzar totes les àrees"</w:t>
       </w:r>
@@ -32687,14 +32739,16 @@
           <w:color w:val="000000"/>
           <w:sz w:val="22"/>
           <w:szCs w:val="22"/>
-        </w:rPr>
-      </w:pPr>
-      <w:r>
-        <w:rPr>
-          <w:rFonts w:ascii="Calibri" w:eastAsia="Calibri" w:hAnsi="Calibri" w:cs="Calibri"/>
-          <w:color w:val="000000"/>
-          <w:sz w:val="22"/>
-          <w:szCs w:val="22"/>
+          <w:lang w:val="pt-PT"/>
+        </w:rPr>
+      </w:pPr>
+      <w:r>
+        <w:rPr>
+          <w:rFonts w:ascii="Calibri" w:eastAsia="Calibri" w:hAnsi="Calibri" w:cs="Calibri"/>
+          <w:color w:val="000000"/>
+          <w:sz w:val="22"/>
+          <w:szCs w:val="22"/>
+          <w:lang w:val="pt-PT"/>
         </w:rPr>
         <w:t>#567 Duplicar dominis entre àrees no funciona</w:t>
       </w:r>
@@ -33639,14 +33693,16 @@
           <w:color w:val="000000"/>
           <w:sz w:val="22"/>
           <w:szCs w:val="22"/>
-        </w:rPr>
-      </w:pPr>
-      <w:r>
-        <w:rPr>
-          <w:rFonts w:ascii="Calibri" w:eastAsia="Calibri" w:hAnsi="Calibri" w:cs="Calibri"/>
-          <w:color w:val="000000"/>
-          <w:sz w:val="22"/>
-          <w:szCs w:val="22"/>
+          <w:lang w:val="pt-PT"/>
+        </w:rPr>
+      </w:pPr>
+      <w:r>
+        <w:rPr>
+          <w:rFonts w:ascii="Calibri" w:eastAsia="Calibri" w:hAnsi="Calibri" w:cs="Calibri"/>
+          <w:color w:val="000000"/>
+          <w:sz w:val="22"/>
+          <w:szCs w:val="22"/>
+          <w:lang w:val="pt-PT"/>
         </w:rPr>
         <w:t xml:space="preserve">#564 Possibilitar consulta de Dominis amb rol de consulta </w:t>
       </w:r>
@@ -33863,14 +33919,16 @@
           <w:color w:val="000000"/>
           <w:sz w:val="22"/>
           <w:szCs w:val="22"/>
-        </w:rPr>
-      </w:pPr>
-      <w:r>
-        <w:rPr>
-          <w:rFonts w:ascii="Calibri" w:eastAsia="Calibri" w:hAnsi="Calibri" w:cs="Calibri"/>
-          <w:color w:val="000000"/>
-          <w:sz w:val="22"/>
-          <w:szCs w:val="22"/>
+          <w:lang w:val="pt-PT"/>
+        </w:rPr>
+      </w:pPr>
+      <w:r>
+        <w:rPr>
+          <w:rFonts w:ascii="Calibri" w:eastAsia="Calibri" w:hAnsi="Calibri" w:cs="Calibri"/>
+          <w:color w:val="000000"/>
+          <w:sz w:val="22"/>
+          <w:szCs w:val="22"/>
+          <w:lang w:val="pt-PT"/>
         </w:rPr>
         <w:t xml:space="preserve">#580 Entrada de texts d'altres fonts (STT) </w:t>
       </w:r>
@@ -33941,14 +33999,16 @@
           <w:color w:val="000000"/>
           <w:sz w:val="22"/>
           <w:szCs w:val="22"/>
-        </w:rPr>
-      </w:pPr>
-      <w:r>
-        <w:rPr>
-          <w:rFonts w:ascii="Calibri" w:eastAsia="Calibri" w:hAnsi="Calibri" w:cs="Calibri"/>
-          <w:color w:val="000000"/>
-          <w:sz w:val="22"/>
-          <w:szCs w:val="22"/>
+          <w:lang w:val="pt-PT"/>
+        </w:rPr>
+      </w:pPr>
+      <w:r>
+        <w:rPr>
+          <w:rFonts w:ascii="Calibri" w:eastAsia="Calibri" w:hAnsi="Calibri" w:cs="Calibri"/>
+          <w:color w:val="000000"/>
+          <w:sz w:val="22"/>
+          <w:szCs w:val="22"/>
+          <w:lang w:val="pt-PT"/>
         </w:rPr>
         <w:t xml:space="preserve">#582 Millora Ajuda Pagaments - Scripts (STG) </w:t>
       </w:r>
@@ -35738,14 +35798,16 @@
           <w:color w:val="000000"/>
           <w:sz w:val="22"/>
           <w:szCs w:val="22"/>
-        </w:rPr>
-      </w:pPr>
-      <w:r>
-        <w:rPr>
-          <w:rFonts w:ascii="Calibri" w:eastAsia="Calibri" w:hAnsi="Calibri" w:cs="Calibri"/>
-          <w:color w:val="000000"/>
-          <w:sz w:val="22"/>
-          <w:szCs w:val="22"/>
+          <w:lang w:val="pt-PT"/>
+        </w:rPr>
+      </w:pPr>
+      <w:r>
+        <w:rPr>
+          <w:rFonts w:ascii="Calibri" w:eastAsia="Calibri" w:hAnsi="Calibri" w:cs="Calibri"/>
+          <w:color w:val="000000"/>
+          <w:sz w:val="22"/>
+          <w:szCs w:val="22"/>
+          <w:lang w:val="pt-PT"/>
         </w:rPr>
         <w:t>#637 BUG a l'importar Dominis de Se a PRO</w:t>
       </w:r>
@@ -37767,14 +37829,16 @@
           <w:color w:val="000000"/>
           <w:sz w:val="22"/>
           <w:szCs w:val="22"/>
-        </w:rPr>
-      </w:pPr>
-      <w:r>
-        <w:rPr>
-          <w:rFonts w:ascii="Calibri" w:eastAsia="Calibri" w:hAnsi="Calibri" w:cs="Calibri"/>
-          <w:color w:val="000000"/>
-          <w:sz w:val="22"/>
-          <w:szCs w:val="22"/>
+          <w:lang w:val="pt-PT"/>
+        </w:rPr>
+      </w:pPr>
+      <w:r>
+        <w:rPr>
+          <w:rFonts w:ascii="Calibri" w:eastAsia="Calibri" w:hAnsi="Calibri" w:cs="Calibri"/>
+          <w:color w:val="000000"/>
+          <w:sz w:val="22"/>
+          <w:szCs w:val="22"/>
+          <w:lang w:val="pt-PT"/>
         </w:rPr>
         <w:t>#652 Modificar ajudes per a alinear mides de camps sicres3</w:t>
       </w:r>
@@ -37845,14 +37909,16 @@
           <w:color w:val="000000"/>
           <w:sz w:val="22"/>
           <w:szCs w:val="22"/>
-        </w:rPr>
-      </w:pPr>
-      <w:r>
-        <w:rPr>
-          <w:rFonts w:ascii="Calibri" w:eastAsia="Calibri" w:hAnsi="Calibri" w:cs="Calibri"/>
-          <w:color w:val="000000"/>
-          <w:sz w:val="22"/>
-          <w:szCs w:val="22"/>
+          <w:lang w:val="pt-PT"/>
+        </w:rPr>
+      </w:pPr>
+      <w:r>
+        <w:rPr>
+          <w:rFonts w:ascii="Calibri" w:eastAsia="Calibri" w:hAnsi="Calibri" w:cs="Calibri"/>
+          <w:color w:val="000000"/>
+          <w:sz w:val="22"/>
+          <w:szCs w:val="22"/>
+          <w:lang w:val="pt-PT"/>
         </w:rPr>
         <w:t>#659 Possibilitar arrossegar arxius per annexar arxius</w:t>
       </w:r>
@@ -38193,14 +38259,16 @@
           <w:color w:val="000000"/>
           <w:sz w:val="22"/>
           <w:szCs w:val="22"/>
-        </w:rPr>
-      </w:pPr>
-      <w:r>
-        <w:rPr>
-          <w:rFonts w:ascii="Calibri" w:eastAsia="Calibri" w:hAnsi="Calibri" w:cs="Calibri"/>
-          <w:color w:val="000000"/>
-          <w:sz w:val="22"/>
-          <w:szCs w:val="22"/>
+          <w:lang w:val="pt-PT"/>
+        </w:rPr>
+      </w:pPr>
+      <w:r>
+        <w:rPr>
+          <w:rFonts w:ascii="Calibri" w:eastAsia="Calibri" w:hAnsi="Calibri" w:cs="Calibri"/>
+          <w:color w:val="000000"/>
+          <w:sz w:val="22"/>
+          <w:szCs w:val="22"/>
+          <w:lang w:val="pt-PT"/>
         </w:rPr>
         <w:t>#505 Canviar a text tots els camps que ara són text àrea i no sigui necessari que ho siguin</w:t>
       </w:r>
@@ -38417,14 +38485,16 @@
           <w:color w:val="000000"/>
           <w:sz w:val="22"/>
           <w:szCs w:val="22"/>
-        </w:rPr>
-      </w:pPr>
-      <w:r>
-        <w:rPr>
-          <w:rFonts w:ascii="Calibri" w:eastAsia="Calibri" w:hAnsi="Calibri" w:cs="Calibri"/>
-          <w:color w:val="000000"/>
-          <w:sz w:val="22"/>
-          <w:szCs w:val="22"/>
+          <w:lang w:val="pt-PT"/>
+        </w:rPr>
+      </w:pPr>
+      <w:r>
+        <w:rPr>
+          <w:rFonts w:ascii="Calibri" w:eastAsia="Calibri" w:hAnsi="Calibri" w:cs="Calibri"/>
+          <w:color w:val="000000"/>
+          <w:sz w:val="22"/>
+          <w:szCs w:val="22"/>
+          <w:lang w:val="pt-PT"/>
         </w:rPr>
         <w:t>#621 Error intentant migrar TF0101SOLCER --&gt; SOL_CERT (i no està duplicat)</w:t>
       </w:r>
@@ -38787,14 +38857,16 @@
           <w:color w:val="000000"/>
           <w:sz w:val="22"/>
           <w:szCs w:val="22"/>
-        </w:rPr>
-      </w:pPr>
-      <w:r>
-        <w:rPr>
-          <w:rFonts w:ascii="Calibri" w:eastAsia="Calibri" w:hAnsi="Calibri" w:cs="Calibri"/>
-          <w:color w:val="000000"/>
-          <w:sz w:val="22"/>
-          <w:szCs w:val="22"/>
+          <w:lang w:val="pt-PT"/>
+        </w:rPr>
+      </w:pPr>
+      <w:r>
+        <w:rPr>
+          <w:rFonts w:ascii="Calibri" w:eastAsia="Calibri" w:hAnsi="Calibri" w:cs="Calibri"/>
+          <w:color w:val="000000"/>
+          <w:sz w:val="22"/>
+          <w:szCs w:val="22"/>
+          <w:lang w:val="pt-PT"/>
         </w:rPr>
         <w:t>#647 Augmentar a 50 caràcters els identificadors de Dominis i Tràmits </w:t>
       </w:r>
@@ -41930,13 +42002,15 @@
         <w:rPr>
           <w:sz w:val="22"/>
           <w:szCs w:val="22"/>
-        </w:rPr>
-      </w:pPr>
-      <w:r>
-        <w:rPr>
-          <w:rFonts w:ascii="Calibri" w:eastAsia="Calibri" w:hAnsi="Calibri" w:cs="Calibri"/>
-          <w:sz w:val="22"/>
-          <w:szCs w:val="22"/>
+          <w:lang w:val="pt-PT"/>
+        </w:rPr>
+      </w:pPr>
+      <w:r>
+        <w:rPr>
+          <w:rFonts w:ascii="Calibri" w:eastAsia="Calibri" w:hAnsi="Calibri" w:cs="Calibri"/>
+          <w:sz w:val="22"/>
+          <w:szCs w:val="22"/>
+          <w:lang w:val="pt-PT"/>
         </w:rPr>
         <w:t>#598 Evitar aferrar texts a qualcuns components</w:t>
       </w:r>
@@ -42324,13 +42398,15 @@
         <w:rPr>
           <w:sz w:val="22"/>
           <w:szCs w:val="22"/>
-        </w:rPr>
-      </w:pPr>
-      <w:r>
-        <w:rPr>
-          <w:rFonts w:ascii="Calibri" w:eastAsia="Calibri" w:hAnsi="Calibri" w:cs="Calibri"/>
-          <w:sz w:val="22"/>
-          <w:szCs w:val="22"/>
+          <w:lang w:val="pt-PT"/>
+        </w:rPr>
+      </w:pPr>
+      <w:r>
+        <w:rPr>
+          <w:rFonts w:ascii="Calibri" w:eastAsia="Calibri" w:hAnsi="Calibri" w:cs="Calibri"/>
+          <w:sz w:val="22"/>
+          <w:szCs w:val="22"/>
+          <w:lang w:val="pt-PT"/>
         </w:rPr>
         <w:t>#714 Recerca i ordre de tràmits associats.-</w:t>
       </w:r>
@@ -42376,13 +42452,15 @@
         <w:rPr>
           <w:sz w:val="22"/>
           <w:szCs w:val="22"/>
-        </w:rPr>
-      </w:pPr>
-      <w:r>
-        <w:rPr>
-          <w:rFonts w:ascii="Calibri" w:eastAsia="Calibri" w:hAnsi="Calibri" w:cs="Calibri"/>
-          <w:sz w:val="22"/>
-          <w:szCs w:val="22"/>
+          <w:lang w:val="pt-PT"/>
+        </w:rPr>
+      </w:pPr>
+      <w:r>
+        <w:rPr>
+          <w:rFonts w:ascii="Calibri" w:eastAsia="Calibri" w:hAnsi="Calibri" w:cs="Calibri"/>
+          <w:sz w:val="22"/>
+          <w:szCs w:val="22"/>
+          <w:lang w:val="pt-PT"/>
         </w:rPr>
         <w:t>#715 Documentar perfil necessari per configurar securitzacions.</w:t>
       </w:r>
@@ -42563,13 +42641,15 @@
         <w:rPr>
           <w:sz w:val="22"/>
           <w:szCs w:val="22"/>
-        </w:rPr>
-      </w:pPr>
-      <w:r>
-        <w:rPr>
-          <w:rFonts w:ascii="Calibri" w:eastAsia="Calibri" w:hAnsi="Calibri" w:cs="Calibri"/>
-          <w:sz w:val="22"/>
-          <w:szCs w:val="22"/>
+          <w:lang w:val="pt-PT"/>
+        </w:rPr>
+      </w:pPr>
+      <w:r>
+        <w:rPr>
+          <w:rFonts w:ascii="Calibri" w:eastAsia="Calibri" w:hAnsi="Calibri" w:cs="Calibri"/>
+          <w:sz w:val="22"/>
+          <w:szCs w:val="22"/>
+          <w:lang w:val="pt-PT"/>
         </w:rPr>
         <w:t>#558 Poder seleccionar i copiar tots els texts que mostri a STG i STH</w:t>
       </w:r>
@@ -43215,13 +43295,15 @@
         <w:rPr>
           <w:sz w:val="22"/>
           <w:szCs w:val="22"/>
-        </w:rPr>
-      </w:pPr>
-      <w:r>
-        <w:rPr>
-          <w:rFonts w:ascii="Calibri" w:eastAsia="Calibri" w:hAnsi="Calibri" w:cs="Calibri"/>
-          <w:sz w:val="22"/>
-          <w:szCs w:val="22"/>
+          <w:lang w:val="pt-PT"/>
+        </w:rPr>
+      </w:pPr>
+      <w:r>
+        <w:rPr>
+          <w:rFonts w:ascii="Calibri" w:eastAsia="Calibri" w:hAnsi="Calibri" w:cs="Calibri"/>
+          <w:sz w:val="22"/>
+          <w:szCs w:val="22"/>
+          <w:lang w:val="pt-PT"/>
         </w:rPr>
         <w:t>#715 Documentar perfil necessari per configurar securitzacions</w:t>
       </w:r>
@@ -43609,13 +43691,15 @@
         <w:rPr>
           <w:sz w:val="22"/>
           <w:szCs w:val="22"/>
-        </w:rPr>
-      </w:pPr>
-      <w:r>
-        <w:rPr>
-          <w:rFonts w:ascii="Calibri" w:eastAsia="Calibri" w:hAnsi="Calibri" w:cs="Calibri"/>
-          <w:sz w:val="22"/>
-          <w:szCs w:val="22"/>
+          <w:lang w:val="pt-PT"/>
+        </w:rPr>
+      </w:pPr>
+      <w:r>
+        <w:rPr>
+          <w:rFonts w:ascii="Calibri" w:eastAsia="Calibri" w:hAnsi="Calibri" w:cs="Calibri"/>
+          <w:sz w:val="22"/>
+          <w:szCs w:val="22"/>
+          <w:lang w:val="pt-PT"/>
         </w:rPr>
         <w:t>#735 Eliminar arxiu .dat adjunt als correus d'incidències S2</w:t>
       </w:r>
@@ -43871,13 +43955,15 @@
         <w:rPr>
           <w:sz w:val="22"/>
           <w:szCs w:val="22"/>
-        </w:rPr>
-      </w:pPr>
-      <w:r>
-        <w:rPr>
-          <w:rFonts w:ascii="Calibri" w:eastAsia="Calibri" w:hAnsi="Calibri" w:cs="Calibri"/>
-          <w:sz w:val="22"/>
-          <w:szCs w:val="22"/>
+          <w:lang w:val="pt-PT"/>
+        </w:rPr>
+      </w:pPr>
+      <w:r>
+        <w:rPr>
+          <w:rFonts w:ascii="Calibri" w:eastAsia="Calibri" w:hAnsi="Calibri" w:cs="Calibri"/>
+          <w:sz w:val="22"/>
+          <w:szCs w:val="22"/>
+          <w:lang w:val="pt-PT"/>
         </w:rPr>
         <w:t>#742 Missatges d'entitat: Desapareixen els botons de gestió</w:t>
       </w:r>
@@ -47206,13 +47292,15 @@
         <w:rPr>
           <w:sz w:val="22"/>
           <w:szCs w:val="22"/>
-        </w:rPr>
-      </w:pPr>
-      <w:r>
-        <w:rPr>
-          <w:rFonts w:ascii="Calibri" w:eastAsia="Calibri" w:hAnsi="Calibri" w:cs="Calibri"/>
-          <w:sz w:val="22"/>
-          <w:szCs w:val="22"/>
+          <w:lang w:val="pt-PT"/>
+        </w:rPr>
+      </w:pPr>
+      <w:r>
+        <w:rPr>
+          <w:rFonts w:ascii="Calibri" w:eastAsia="Calibri" w:hAnsi="Calibri" w:cs="Calibri"/>
+          <w:sz w:val="22"/>
+          <w:szCs w:val="22"/>
+          <w:lang w:val="pt-PT"/>
         </w:rPr>
         <w:t>#765 Incloure gestió nou IDP de cl@ve</w:t>
       </w:r>
@@ -48628,13 +48716,15 @@
         <w:rPr>
           <w:sz w:val="22"/>
           <w:szCs w:val="22"/>
-        </w:rPr>
-      </w:pPr>
-      <w:r>
-        <w:rPr>
-          <w:rFonts w:ascii="Calibri" w:eastAsia="Calibri" w:hAnsi="Calibri" w:cs="Calibri"/>
-          <w:sz w:val="22"/>
-          <w:szCs w:val="22"/>
+          <w:lang w:val="pt-PT"/>
+        </w:rPr>
+      </w:pPr>
+      <w:r>
+        <w:rPr>
+          <w:rFonts w:ascii="Calibri" w:eastAsia="Calibri" w:hAnsi="Calibri" w:cs="Calibri"/>
+          <w:sz w:val="22"/>
+          <w:szCs w:val="22"/>
+          <w:lang w:val="pt-PT"/>
         </w:rPr>
         <w:t>#554 Fer primar els missatges d'avís d'entitat per damunt de tot</w:t>
       </w:r>
@@ -49901,8 +49991,14 @@
         </w:numPr>
         <w:spacing w:before="0" w:after="0"/>
         <w:ind w:left="360"/>
-      </w:pPr>
-      <w:r>
+        <w:rPr>
+          <w:lang w:val="pt-PT"/>
+        </w:rPr>
+      </w:pPr>
+      <w:r>
+        <w:rPr>
+          <w:lang w:val="pt-PT"/>
+        </w:rPr>
         <w:t>#835 Actualitzar Formació avançada i ajuda contextual</w:t>
       </w:r>
     </w:p>
@@ -50530,8 +50626,14 @@
         </w:numPr>
         <w:spacing w:before="0" w:after="0"/>
         <w:ind w:left="360"/>
-      </w:pPr>
-      <w:r>
+        <w:rPr>
+          <w:lang w:val="pt-PT"/>
+        </w:rPr>
+      </w:pPr>
+      <w:r>
+        <w:rPr>
+          <w:lang w:val="pt-PT"/>
+        </w:rPr>
         <w:t>#837 Canviar "sessions ok" per "Sessions finalitzades" al QC</w:t>
       </w:r>
     </w:p>
@@ -51629,8 +51731,14 @@
         </w:numPr>
         <w:spacing w:before="0" w:after="0"/>
         <w:ind w:left="360"/>
-      </w:pPr>
-      <w:r>
+        <w:rPr>
+          <w:lang w:val="pt-PT"/>
+        </w:rPr>
+      </w:pPr>
+      <w:r>
+        <w:rPr>
+          <w:lang w:val="pt-PT"/>
+        </w:rPr>
         <w:t>#751 Canvis a capçalera autoformatador i a frontal S2</w:t>
       </w:r>
     </w:p>
@@ -51801,8 +51909,14 @@
         </w:numPr>
         <w:spacing w:before="0" w:after="0"/>
         <w:ind w:left="360"/>
-      </w:pPr>
-      <w:r>
+        <w:rPr>
+          <w:lang w:val="pt-PT"/>
+        </w:rPr>
+      </w:pPr>
+      <w:r>
+        <w:rPr>
+          <w:lang w:val="pt-PT"/>
+        </w:rPr>
         <w:t>#844 - Migrar tots els Dominis actuals de S1 cap a la BD de S2</w:t>
       </w:r>
     </w:p>
@@ -52188,8 +52302,14 @@
         </w:numPr>
         <w:spacing w:before="0" w:after="0"/>
         <w:ind w:left="360"/>
-      </w:pPr>
-      <w:r>
+        <w:rPr>
+          <w:lang w:val="pt-PT"/>
+        </w:rPr>
+      </w:pPr>
+      <w:r>
+        <w:rPr>
+          <w:lang w:val="pt-PT"/>
+        </w:rPr>
         <w:t>#883 - Definir per defecte només "Autenticat"</w:t>
       </w:r>
     </w:p>
@@ -53291,8 +53411,14 @@
         </w:numPr>
         <w:spacing w:before="0" w:after="0"/>
         <w:ind w:left="360"/>
-      </w:pPr>
-      <w:r>
+        <w:rPr>
+          <w:lang w:val="pt-PT"/>
+        </w:rPr>
+      </w:pPr>
+      <w:r>
+        <w:rPr>
+          <w:lang w:val="pt-PT"/>
+        </w:rPr>
         <w:t>#922 Evitar creació de nou pagament sense haver descartat des de S2</w:t>
       </w:r>
     </w:p>
@@ -53373,14 +53499,23 @@
         </w:numPr>
         <w:spacing w:before="0" w:after="0"/>
         <w:ind w:left="360"/>
+        <w:rPr>
+          <w:lang w:val="pt-PT"/>
+        </w:rPr>
       </w:pPr>
       <w:bookmarkStart w:id="131" w:name="_bwh0gnovgw8m" w:colFirst="0" w:colLast="0"/>
       <w:bookmarkEnd w:id="131"/>
       <w:r>
+        <w:rPr>
+          <w:lang w:val="pt-PT"/>
+        </w:rPr>
         <w:t xml:space="preserve">#955 </w:t>
       </w:r>
       <w:hyperlink r:id="rId22">
         <w:r>
+          <w:rPr>
+            <w:lang w:val="pt-PT"/>
+          </w:rPr>
           <w:t>Botons buits als paràmetres d'un camp Domini</w:t>
         </w:r>
       </w:hyperlink>
@@ -55284,8 +55419,14 @@
         </w:numPr>
         <w:spacing w:before="0" w:after="0"/>
         <w:ind w:left="360"/>
-      </w:pPr>
-      <w:r>
+        <w:rPr>
+          <w:lang w:val="pt-PT"/>
+        </w:rPr>
+      </w:pPr>
+      <w:r>
+        <w:rPr>
+          <w:lang w:val="pt-PT"/>
+        </w:rPr>
         <w:t>#966, Demana email de nova entitat quan només hem introduït un logo</w:t>
       </w:r>
     </w:p>
@@ -56340,7 +56481,13 @@
       </w:r>
       <w:r>
         <w:br/>
-        <w:t>Se modifica la consulta para obtener también los registros de la tabla STT_SESION.</w:t>
+        <w:t>Se modifica la consulta para obtener también los registros de la tabla STT_SESION</w:t>
+      </w:r>
+      <w:r>
+        <w:t>. Además, se separa la cuenta de los errores de tramitación de los de plataforma</w:t>
+      </w:r>
+      <w:r>
+        <w:t>.</w:t>
       </w:r>
     </w:p>
     <w:p>
@@ -56596,6 +56743,22 @@
       </w:pPr>
     </w:p>
     <w:p>
+      <w:r>
+        <w:t>#984 Bug en àudio del component captcha</w:t>
+      </w:r>
+    </w:p>
+    <w:p>
+      <w:r>
+        <w:t>Se resuelve un problema con el audio del componente captcha, al no actualizarse en caso de introducir mal el dato solicitado.</w:t>
+      </w:r>
+    </w:p>
+    <w:p>
+      <w:pPr>
+        <w:spacing w:before="0" w:after="0"/>
+        <w:ind w:left="360"/>
+      </w:pPr>
+    </w:p>
+    <w:p>
       <w:pPr>
         <w:numPr>
           <w:ilvl w:val="0"/>
@@ -56605,16 +56768,7 @@
         <w:ind w:left="360"/>
       </w:pPr>
       <w:r>
-        <w:t>#9</w:t>
-      </w:r>
-      <w:r>
-        <w:t>86</w:t>
-      </w:r>
-      <w:r>
-        <w:t xml:space="preserve"> </w:t>
-      </w:r>
-      <w:r>
-        <w:t>Bug en àudio del component captcha</w:t>
+        <w:t>#986 Bug en àudio del component captcha</w:t>
       </w:r>
     </w:p>
     <w:p>
@@ -56837,6 +56991,7 @@
         <w:ind w:left="360"/>
       </w:pPr>
       <w:r>
+        <w:lastRenderedPageBreak/>
         <w:t>Se modifica el mensaje a “Versión bloqueada” al intentar exportar una versión bloqueada.</w:t>
       </w:r>
     </w:p>

</xml_diff>